<commit_message>
Enhance Bow-Tie analysis documents with color-coded tables
Improved versions of the 3 Bow-Tie risk analyses with:
- Color-coded tables (green preventive, red consequences, blue recovery)
- 7 structured sections per document
- Professional formatting with metadata tables
- References to Panasur procedures (TP-FOR-SST-011/012, TP-PRO-MAN-001)

https://claude.ai/code/session_0128DBXnpKgTiA2pL1zLYKVi
</commit_message>
<xml_diff>
--- a/sig360-panasur/docs/nivel-III/matrices/TP-BT-SST-001.docx
+++ b/sig360-panasur/docs/nivel-III/matrices/TP-BT-SST-001.docx
@@ -8,6 +8,7 @@
       </w:pPr>
       <w:r>
         <w:rPr>
+          <w:rFonts w:ascii="Calibri" w:hAnsi="Calibri"/>
           <w:b/>
           <w:sz w:val="28"/>
         </w:rPr>
@@ -20,11 +21,12 @@
       </w:pPr>
       <w:r>
         <w:rPr>
+          <w:rFonts w:ascii="Calibri" w:hAnsi="Calibri"/>
           <w:b/>
           <w:color w:val="1A6B4E"/>
           <w:sz w:val="24"/>
         </w:rPr>
-        <w:t>SISTEMA INTEGRADO DE GESTIÓN — ANÁLISIS BOW-TIE</w:t>
+        <w:t>SISTEMA INTEGRADO DE GESTIÓN</w:t>
       </w:r>
     </w:p>
     <w:p>
@@ -33,60 +35,101 @@
       </w:pPr>
       <w:r>
         <w:rPr>
+          <w:rFonts w:ascii="Calibri" w:hAnsi="Calibri"/>
           <w:b/>
-          <w:sz w:val="30"/>
+          <w:sz w:val="32"/>
         </w:rPr>
-        <w:t>Análisis Bow-Tie: Volcadura de Vehículo de Transporte</w:t>
+        <w:t>Análisis Bow-Tie</w:t>
+        <w:br/>
+        <w:t>Volcadura de Vehículo de Transporte de Carga</w:t>
       </w:r>
     </w:p>
     <w:tbl>
       <w:tblPr>
+        <w:tblStyle w:val="TableGrid"/>
         <w:tblW w:type="auto" w:w="0"/>
+        <w:jc w:val="center"/>
         <w:tblLook w:firstColumn="1" w:firstRow="1" w:lastColumn="0" w:lastRow="0" w:noHBand="0" w:noVBand="1" w:val="04A0"/>
       </w:tblPr>
       <w:tblGrid>
-        <w:gridCol w:w="2160"/>
-        <w:gridCol w:w="2160"/>
-        <w:gridCol w:w="2160"/>
-        <w:gridCol w:w="2160"/>
+        <w:gridCol w:w="2493"/>
+        <w:gridCol w:w="2493"/>
+        <w:gridCol w:w="2493"/>
+        <w:gridCol w:w="2493"/>
       </w:tblGrid>
       <w:tr>
         <w:tc>
           <w:tcPr>
-            <w:tcW w:type="dxa" w:w="2160"/>
+            <w:tcW w:type="dxa" w:w="2493"/>
+            <w:shd w:fill="E8F5E9"/>
           </w:tcPr>
           <w:p>
+            <w:pPr>
+              <w:jc w:val="left"/>
+            </w:pPr>
+            <w:r/>
             <w:r>
+              <w:rPr>
+                <w:rFonts w:ascii="Calibri" w:hAnsi="Calibri"/>
+                <w:b/>
+                <w:sz w:val="20"/>
+              </w:rPr>
               <w:t>Código:</w:t>
             </w:r>
           </w:p>
         </w:tc>
         <w:tc>
           <w:tcPr>
-            <w:tcW w:type="dxa" w:w="2160"/>
+            <w:tcW w:type="dxa" w:w="2493"/>
           </w:tcPr>
           <w:p>
+            <w:pPr>
+              <w:jc w:val="left"/>
+            </w:pPr>
+            <w:r/>
             <w:r>
+              <w:rPr>
+                <w:rFonts w:ascii="Calibri" w:hAnsi="Calibri"/>
+                <w:sz w:val="20"/>
+              </w:rPr>
               <w:t>TP-BT-SST-001</w:t>
             </w:r>
           </w:p>
         </w:tc>
         <w:tc>
           <w:tcPr>
-            <w:tcW w:type="dxa" w:w="2160"/>
+            <w:tcW w:type="dxa" w:w="2493"/>
+            <w:shd w:fill="E8F5E9"/>
           </w:tcPr>
           <w:p>
+            <w:pPr>
+              <w:jc w:val="left"/>
+            </w:pPr>
+            <w:r/>
             <w:r>
+              <w:rPr>
+                <w:rFonts w:ascii="Calibri" w:hAnsi="Calibri"/>
+                <w:b/>
+                <w:sz w:val="20"/>
+              </w:rPr>
               <w:t>Versión:</w:t>
             </w:r>
           </w:p>
         </w:tc>
         <w:tc>
           <w:tcPr>
-            <w:tcW w:type="dxa" w:w="2160"/>
+            <w:tcW w:type="dxa" w:w="2493"/>
           </w:tcPr>
           <w:p>
+            <w:pPr>
+              <w:jc w:val="left"/>
+            </w:pPr>
+            <w:r/>
             <w:r>
+              <w:rPr>
+                <w:rFonts w:ascii="Calibri" w:hAnsi="Calibri"/>
+                <w:sz w:val="20"/>
+              </w:rPr>
               <w:t>1.0</w:t>
             </w:r>
           </w:p>
@@ -95,40 +138,76 @@
       <w:tr>
         <w:tc>
           <w:tcPr>
-            <w:tcW w:type="dxa" w:w="2160"/>
+            <w:tcW w:type="dxa" w:w="2493"/>
+            <w:shd w:fill="E8F5E9"/>
           </w:tcPr>
           <w:p>
+            <w:pPr>
+              <w:jc w:val="left"/>
+            </w:pPr>
+            <w:r/>
             <w:r>
+              <w:rPr>
+                <w:rFonts w:ascii="Calibri" w:hAnsi="Calibri"/>
+                <w:b/>
+                <w:sz w:val="20"/>
+              </w:rPr>
               <w:t>Área:</w:t>
             </w:r>
           </w:p>
         </w:tc>
         <w:tc>
           <w:tcPr>
-            <w:tcW w:type="dxa" w:w="2160"/>
+            <w:tcW w:type="dxa" w:w="2493"/>
           </w:tcPr>
           <w:p>
+            <w:pPr>
+              <w:jc w:val="left"/>
+            </w:pPr>
+            <w:r/>
             <w:r>
+              <w:rPr>
+                <w:rFonts w:ascii="Calibri" w:hAnsi="Calibri"/>
+                <w:sz w:val="20"/>
+              </w:rPr>
               <w:t>SST</w:t>
             </w:r>
           </w:p>
         </w:tc>
         <w:tc>
           <w:tcPr>
-            <w:tcW w:type="dxa" w:w="2160"/>
+            <w:tcW w:type="dxa" w:w="2493"/>
+            <w:shd w:fill="E8F5E9"/>
           </w:tcPr>
           <w:p>
+            <w:pPr>
+              <w:jc w:val="left"/>
+            </w:pPr>
+            <w:r/>
             <w:r>
+              <w:rPr>
+                <w:rFonts w:ascii="Calibri" w:hAnsi="Calibri"/>
+                <w:b/>
+                <w:sz w:val="20"/>
+              </w:rPr>
               <w:t>Fecha:</w:t>
             </w:r>
           </w:p>
         </w:tc>
         <w:tc>
           <w:tcPr>
-            <w:tcW w:type="dxa" w:w="2160"/>
+            <w:tcW w:type="dxa" w:w="2493"/>
           </w:tcPr>
           <w:p>
+            <w:pPr>
+              <w:jc w:val="left"/>
+            </w:pPr>
+            <w:r/>
             <w:r>
+              <w:rPr>
+                <w:rFonts w:ascii="Calibri" w:hAnsi="Calibri"/>
+                <w:sz w:val="20"/>
+              </w:rPr>
               <w:t>2026-04-03</w:t>
             </w:r>
           </w:p>
@@ -137,41 +216,155 @@
       <w:tr>
         <w:tc>
           <w:tcPr>
-            <w:tcW w:type="dxa" w:w="2160"/>
+            <w:tcW w:type="dxa" w:w="2493"/>
+            <w:shd w:fill="E8F5E9"/>
           </w:tcPr>
           <w:p>
+            <w:pPr>
+              <w:jc w:val="left"/>
+            </w:pPr>
+            <w:r/>
             <w:r>
-              <w:t>Proyecto:</w:t>
+              <w:rPr>
+                <w:rFonts w:ascii="Calibri" w:hAnsi="Calibri"/>
+                <w:b/>
+                <w:sz w:val="20"/>
+              </w:rPr>
+              <w:t>Elaborado:</w:t>
             </w:r>
           </w:p>
         </w:tc>
         <w:tc>
           <w:tcPr>
-            <w:tcW w:type="dxa" w:w="2160"/>
+            <w:tcW w:type="dxa" w:w="2493"/>
           </w:tcPr>
           <w:p>
+            <w:pPr>
+              <w:jc w:val="left"/>
+            </w:pPr>
+            <w:r/>
             <w:r>
-              <w:t>CSF Hanaqpampa</w:t>
+              <w:rPr>
+                <w:rFonts w:ascii="Calibri" w:hAnsi="Calibri"/>
+                <w:sz w:val="20"/>
+              </w:rPr>
+              <w:t>INNOVAQ SOLUTIONS</w:t>
             </w:r>
           </w:p>
         </w:tc>
         <w:tc>
           <w:tcPr>
-            <w:tcW w:type="dxa" w:w="2160"/>
+            <w:tcW w:type="dxa" w:w="2493"/>
+            <w:shd w:fill="E8F5E9"/>
           </w:tcPr>
           <w:p>
+            <w:pPr>
+              <w:jc w:val="left"/>
+            </w:pPr>
+            <w:r/>
             <w:r>
-              <w:t>Cliente:</w:t>
+              <w:rPr>
+                <w:rFonts w:ascii="Calibri" w:hAnsi="Calibri"/>
+                <w:b/>
+                <w:sz w:val="20"/>
+              </w:rPr>
+              <w:t>Revisado:</w:t>
             </w:r>
           </w:p>
         </w:tc>
         <w:tc>
           <w:tcPr>
-            <w:tcW w:type="dxa" w:w="2160"/>
+            <w:tcW w:type="dxa" w:w="2493"/>
           </w:tcPr>
           <w:p>
+            <w:pPr>
+              <w:jc w:val="left"/>
+            </w:pPr>
+            <w:r/>
             <w:r>
-              <w:t>ENGIE Energía Perú</w:t>
+              <w:rPr>
+                <w:rFonts w:ascii="Calibri" w:hAnsi="Calibri"/>
+                <w:sz w:val="20"/>
+              </w:rPr>
+              <w:t>Supervisor SST</w:t>
+            </w:r>
+          </w:p>
+        </w:tc>
+      </w:tr>
+      <w:tr>
+        <w:tc>
+          <w:tcPr>
+            <w:tcW w:type="dxa" w:w="2493"/>
+            <w:shd w:fill="E8F5E9"/>
+          </w:tcPr>
+          <w:p>
+            <w:pPr>
+              <w:jc w:val="left"/>
+            </w:pPr>
+            <w:r/>
+            <w:r>
+              <w:rPr>
+                <w:rFonts w:ascii="Calibri" w:hAnsi="Calibri"/>
+                <w:b/>
+                <w:sz w:val="20"/>
+              </w:rPr>
+              <w:t>Aprobado:</w:t>
+            </w:r>
+          </w:p>
+        </w:tc>
+        <w:tc>
+          <w:tcPr>
+            <w:tcW w:type="dxa" w:w="2493"/>
+          </w:tcPr>
+          <w:p>
+            <w:pPr>
+              <w:jc w:val="left"/>
+            </w:pPr>
+            <w:r/>
+            <w:r>
+              <w:rPr>
+                <w:rFonts w:ascii="Calibri" w:hAnsi="Calibri"/>
+                <w:sz w:val="20"/>
+              </w:rPr>
+              <w:t>Gerente General</w:t>
+            </w:r>
+          </w:p>
+        </w:tc>
+        <w:tc>
+          <w:tcPr>
+            <w:tcW w:type="dxa" w:w="2493"/>
+            <w:shd w:fill="E8F5E9"/>
+          </w:tcPr>
+          <w:p>
+            <w:pPr>
+              <w:jc w:val="left"/>
+            </w:pPr>
+            <w:r/>
+            <w:r>
+              <w:rPr>
+                <w:rFonts w:ascii="Calibri" w:hAnsi="Calibri"/>
+                <w:b/>
+                <w:sz w:val="20"/>
+              </w:rPr>
+              <w:t>Páginas:</w:t>
+            </w:r>
+          </w:p>
+        </w:tc>
+        <w:tc>
+          <w:tcPr>
+            <w:tcW w:type="dxa" w:w="2493"/>
+          </w:tcPr>
+          <w:p>
+            <w:pPr>
+              <w:jc w:val="left"/>
+            </w:pPr>
+            <w:r/>
+            <w:r>
+              <w:rPr>
+                <w:rFonts w:ascii="Calibri" w:hAnsi="Calibri"/>
+                <w:sz w:val="20"/>
+              </w:rPr>
+              <w:t>1 de 5</w:t>
             </w:r>
           </w:p>
         </w:tc>
@@ -183,12 +376,19 @@
         <w:pStyle w:val="Heading2"/>
       </w:pPr>
       <w:r>
-        <w:t>1. PELIGRO (Hazard)</w:t>
+        <w:rPr>
+          <w:rFonts w:ascii="Calibri" w:hAnsi="Calibri"/>
+        </w:rPr>
+        <w:t>1. Objetivo</w:t>
       </w:r>
     </w:p>
     <w:p>
       <w:r>
-        <w:t>Transporte de carga pesada por vías rurales de montaña hacia CSF Hanaqpampa</w:t>
+        <w:rPr>
+          <w:rFonts w:ascii="Calibri" w:hAnsi="Calibri"/>
+          <w:sz w:val="22"/>
+        </w:rPr>
+        <w:t>Identificar y analizar mediante la metodología Bow-Tie las amenazas, barreras preventivas, consecuencias y barreras de recuperación asociadas al evento principal, con el fin de gestionar eficazmente los riesgos en las operaciones del proyecto CSF Hanaqpampa.</w:t>
       </w:r>
     </w:p>
     <w:p>
@@ -196,17 +396,19 @@
         <w:pStyle w:val="Heading2"/>
       </w:pPr>
       <w:r>
-        <w:t>2. EVENTO TOPE (Top Event)</w:t>
+        <w:rPr>
+          <w:rFonts w:ascii="Calibri" w:hAnsi="Calibri"/>
+        </w:rPr>
+        <w:t>2. Alcance</w:t>
       </w:r>
     </w:p>
     <w:p>
       <w:r>
         <w:rPr>
-          <w:b/>
-          <w:color w:val="DC2626"/>
-          <w:sz w:val="26"/>
+          <w:rFonts w:ascii="Calibri" w:hAnsi="Calibri"/>
+          <w:sz w:val="22"/>
         </w:rPr>
-        <w:t>VOLCADURA DEL VEHÍCULO (volquete/cisterna/cargador frontal)</w:t>
+        <w:t>Este análisis aplica a todas las actividades relacionadas con el proyecto Central Solar Fotovoltaica Hanaqpampa, ubicado en Moquegua, Perú, ejecutado por Tours Panasur E.I.R.L. como contratista de ENGIE Energía Perú S.A.</w:t>
       </w:r>
     </w:p>
     <w:p>
@@ -214,55 +416,34 @@
         <w:pStyle w:val="Heading2"/>
       </w:pPr>
       <w:r>
-        <w:t>3. AMENAZAS (Threats) — Lado Izquierdo</w:t>
+        <w:rPr>
+          <w:rFonts w:ascii="Calibri" w:hAnsi="Calibri"/>
+        </w:rPr>
+        <w:t>3. Metodología Bow-Tie</w:t>
       </w:r>
     </w:p>
     <w:p>
-      <w:pPr>
-        <w:pStyle w:val="ListBullet"/>
-      </w:pPr>
       <w:r>
-        <w:t>Exceso de velocidad en curvas y pendientes</w:t>
+        <w:rPr>
+          <w:rFonts w:ascii="Calibri" w:hAnsi="Calibri"/>
+          <w:sz w:val="22"/>
+        </w:rPr>
+        <w:t>La metodología Bow-Tie es una herramienta de gestión de riesgos que permite visualizar de forma gráfica la relación entre las causas (amenazas), el evento principal (Top Event), las consecuencias y las barreras de control. El diagrama tiene forma de corbata de moño (Bow-Tie) donde el nudo central representa el evento no deseado.</w:t>
       </w:r>
     </w:p>
     <w:p>
-      <w:pPr>
-        <w:pStyle w:val="ListBullet"/>
-      </w:pPr>
       <w:r>
-        <w:t>Fatiga y somnolencia del conductor (jornadas extendidas)</w:t>
-      </w:r>
-    </w:p>
-    <w:p>
-      <w:pPr>
-        <w:pStyle w:val="ListBullet"/>
-      </w:pPr>
-      <w:r>
-        <w:t>Falla mecánica: frenos, dirección, neumáticos</w:t>
-      </w:r>
-    </w:p>
-    <w:p>
-      <w:pPr>
-        <w:pStyle w:val="ListBullet"/>
-      </w:pPr>
-      <w:r>
-        <w:t>Vía en mal estado: baches, deslizamientos, tramos sin señalizar</w:t>
-      </w:r>
-    </w:p>
-    <w:p>
-      <w:pPr>
-        <w:pStyle w:val="ListBullet"/>
-      </w:pPr>
-      <w:r>
-        <w:t>Sobrecarga del vehículo o carga mal asegurada</w:t>
-      </w:r>
-    </w:p>
-    <w:p>
-      <w:pPr>
-        <w:pStyle w:val="ListBullet"/>
-      </w:pPr>
-      <w:r>
-        <w:t>Condiciones climáticas adversas: neblina, lluvia, viento lateral</w:t>
+        <w:rPr>
+          <w:rFonts w:ascii="Calibri" w:hAnsi="Calibri"/>
+          <w:sz w:val="20"/>
+        </w:rPr>
+        <w:t>• Lado izquierdo: Amenazas y Barreras Preventivas (evitan que ocurra el evento)</w:t>
+        <w:br/>
+        <w:t>• Centro: Evento Principal (Top Event) — punto de pérdida de control</w:t>
+        <w:br/>
+        <w:t>• Lado derecho: Consecuencias y Barreras de Recuperación (mitigan el impacto)</w:t>
+        <w:br/>
+        <w:t>• Factores de escalamiento: condiciones que pueden degradar las barreras</w:t>
       </w:r>
     </w:p>
     <w:p>
@@ -270,60 +451,1689 @@
         <w:pStyle w:val="Heading2"/>
       </w:pPr>
       <w:r>
-        <w:t>4. BARRERAS PREVENTIVAS (Prevention)</w:t>
+        <w:rPr>
+          <w:rFonts w:ascii="Calibri" w:hAnsi="Calibri"/>
+        </w:rPr>
+        <w:t>4. Análisis Bow-Tie — Volcadura de Vehículo de Transporte de Carga</w:t>
+      </w:r>
+    </w:p>
+    <w:tbl>
+      <w:tblPr>
+        <w:tblStyle w:val="TableGrid"/>
+        <w:tblW w:type="auto" w:w="0"/>
+        <w:jc w:val="center"/>
+        <w:tblLook w:firstColumn="1" w:firstRow="1" w:lastColumn="0" w:lastRow="0" w:noHBand="0" w:noVBand="1" w:val="04A0"/>
+      </w:tblPr>
+      <w:tblGrid>
+        <w:gridCol w:w="4986"/>
+        <w:gridCol w:w="4986"/>
+      </w:tblGrid>
+      <w:tr>
+        <w:tc>
+          <w:tcPr>
+            <w:tcW w:type="dxa" w:w="3402"/>
+            <w:shd w:fill="1A6B4E"/>
+          </w:tcPr>
+          <w:p>
+            <w:pPr>
+              <w:jc w:val="left"/>
+            </w:pPr>
+            <w:r/>
+            <w:r>
+              <w:rPr>
+                <w:rFonts w:ascii="Calibri" w:hAnsi="Calibri"/>
+                <w:b/>
+                <w:color w:val="FFFFFF"/>
+                <w:sz w:val="20"/>
+              </w:rPr>
+              <w:t>PELIGRO (Hazard)</w:t>
+            </w:r>
+          </w:p>
+        </w:tc>
+        <w:tc>
+          <w:tcPr>
+            <w:tcW w:type="dxa" w:w="6803"/>
+          </w:tcPr>
+          <w:p>
+            <w:pPr>
+              <w:jc w:val="left"/>
+            </w:pPr>
+            <w:r/>
+            <w:r>
+              <w:rPr>
+                <w:rFonts w:ascii="Calibri" w:hAnsi="Calibri"/>
+                <w:sz w:val="20"/>
+              </w:rPr>
+              <w:t>Transporte de carga pesada por vías rurales de montaña</w:t>
+            </w:r>
+          </w:p>
+        </w:tc>
+      </w:tr>
+      <w:tr>
+        <w:tc>
+          <w:tcPr>
+            <w:tcW w:type="dxa" w:w="3402"/>
+            <w:shd w:fill="1A6B4E"/>
+          </w:tcPr>
+          <w:p>
+            <w:pPr>
+              <w:jc w:val="left"/>
+            </w:pPr>
+            <w:r/>
+            <w:r>
+              <w:rPr>
+                <w:rFonts w:ascii="Calibri" w:hAnsi="Calibri"/>
+                <w:b/>
+                <w:color w:val="FFFFFF"/>
+                <w:sz w:val="20"/>
+              </w:rPr>
+              <w:t>EVENTO PRINCIPAL (Top Event)</w:t>
+            </w:r>
+          </w:p>
+        </w:tc>
+        <w:tc>
+          <w:tcPr>
+            <w:tcW w:type="dxa" w:w="6803"/>
+            <w:shd w:fill="FFEBEE"/>
+          </w:tcPr>
+          <w:p>
+            <w:pPr>
+              <w:jc w:val="left"/>
+            </w:pPr>
+            <w:r/>
+            <w:r>
+              <w:rPr>
+                <w:rFonts w:ascii="Calibri" w:hAnsi="Calibri"/>
+                <w:sz w:val="20"/>
+              </w:rPr>
+              <w:t>Volcadura del vehículo (volquete/cisterna)</w:t>
+            </w:r>
+          </w:p>
+        </w:tc>
+      </w:tr>
+      <w:tr>
+        <w:tc>
+          <w:tcPr>
+            <w:tcW w:type="dxa" w:w="3402"/>
+            <w:shd w:fill="1A6B4E"/>
+          </w:tcPr>
+          <w:p>
+            <w:pPr>
+              <w:jc w:val="left"/>
+            </w:pPr>
+            <w:r/>
+            <w:r>
+              <w:rPr>
+                <w:rFonts w:ascii="Calibri" w:hAnsi="Calibri"/>
+                <w:b/>
+                <w:color w:val="FFFFFF"/>
+                <w:sz w:val="20"/>
+              </w:rPr>
+              <w:t>PROYECTO / UBICACIÓN</w:t>
+            </w:r>
+          </w:p>
+        </w:tc>
+        <w:tc>
+          <w:tcPr>
+            <w:tcW w:type="dxa" w:w="6803"/>
+          </w:tcPr>
+          <w:p>
+            <w:pPr>
+              <w:jc w:val="left"/>
+            </w:pPr>
+            <w:r/>
+            <w:r>
+              <w:rPr>
+                <w:rFonts w:ascii="Calibri" w:hAnsi="Calibri"/>
+                <w:sz w:val="20"/>
+              </w:rPr>
+              <w:t>CSF Hanaqpampa — Moquegua, Perú (Cliente: ENGIE)</w:t>
+            </w:r>
+          </w:p>
+        </w:tc>
+      </w:tr>
+    </w:tbl>
+    <w:p/>
+    <w:p>
+      <w:r>
+        <w:rPr>
+          <w:b/>
+        </w:rPr>
+        <w:t>LADO IZQUIERDO — AMENAZAS Y BARRERAS PREVENTIVAS</w:t>
+      </w:r>
+    </w:p>
+    <w:tbl>
+      <w:tblPr>
+        <w:tblStyle w:val="TableGrid"/>
+        <w:tblW w:type="auto" w:w="0"/>
+        <w:jc w:val="center"/>
+        <w:tblLook w:firstColumn="1" w:firstRow="1" w:lastColumn="0" w:lastRow="0" w:noHBand="0" w:noVBand="1" w:val="04A0"/>
+      </w:tblPr>
+      <w:tblGrid>
+        <w:gridCol w:w="3324"/>
+        <w:gridCol w:w="3324"/>
+        <w:gridCol w:w="3324"/>
+      </w:tblGrid>
+      <w:tr>
+        <w:tc>
+          <w:tcPr>
+            <w:tcW w:type="dxa" w:w="850"/>
+            <w:shd w:fill="1A6B4E"/>
+          </w:tcPr>
+          <w:p>
+            <w:pPr>
+              <w:jc w:val="center"/>
+            </w:pPr>
+            <w:r/>
+            <w:r>
+              <w:rPr>
+                <w:rFonts w:ascii="Calibri" w:hAnsi="Calibri"/>
+                <w:b/>
+                <w:color w:val="FFFFFF"/>
+                <w:sz w:val="18"/>
+              </w:rPr>
+              <w:t>N°</w:t>
+            </w:r>
+          </w:p>
+        </w:tc>
+        <w:tc>
+          <w:tcPr>
+            <w:tcW w:type="dxa" w:w="4535"/>
+            <w:shd w:fill="1A6B4E"/>
+          </w:tcPr>
+          <w:p>
+            <w:pPr>
+              <w:jc w:val="center"/>
+            </w:pPr>
+            <w:r/>
+            <w:r>
+              <w:rPr>
+                <w:rFonts w:ascii="Calibri" w:hAnsi="Calibri"/>
+                <w:b/>
+                <w:color w:val="FFFFFF"/>
+                <w:sz w:val="18"/>
+              </w:rPr>
+              <w:t>AMENAZA (Threat)</w:t>
+            </w:r>
+          </w:p>
+        </w:tc>
+        <w:tc>
+          <w:tcPr>
+            <w:tcW w:type="dxa" w:w="4819"/>
+            <w:shd w:fill="1A6B4E"/>
+          </w:tcPr>
+          <w:p>
+            <w:pPr>
+              <w:jc w:val="center"/>
+            </w:pPr>
+            <w:r/>
+            <w:r>
+              <w:rPr>
+                <w:rFonts w:ascii="Calibri" w:hAnsi="Calibri"/>
+                <w:b/>
+                <w:color w:val="FFFFFF"/>
+                <w:sz w:val="18"/>
+              </w:rPr>
+              <w:t>BARRERA PREVENTIVA (Prevention)</w:t>
+            </w:r>
+          </w:p>
+        </w:tc>
+      </w:tr>
+      <w:tr>
+        <w:tc>
+          <w:tcPr>
+            <w:tcW w:type="dxa" w:w="850"/>
+            <w:shd w:fill="FFFFFF"/>
+          </w:tcPr>
+          <w:p>
+            <w:pPr>
+              <w:jc w:val="center"/>
+            </w:pPr>
+            <w:r/>
+            <w:r>
+              <w:rPr>
+                <w:rFonts w:ascii="Calibri" w:hAnsi="Calibri"/>
+                <w:sz w:val="18"/>
+              </w:rPr>
+              <w:t>1</w:t>
+            </w:r>
+          </w:p>
+        </w:tc>
+        <w:tc>
+          <w:tcPr>
+            <w:tcW w:type="dxa" w:w="4535"/>
+            <w:shd w:fill="FFF3E0"/>
+          </w:tcPr>
+          <w:p>
+            <w:pPr>
+              <w:jc w:val="left"/>
+            </w:pPr>
+            <w:r/>
+            <w:r>
+              <w:rPr>
+                <w:rFonts w:ascii="Calibri" w:hAnsi="Calibri"/>
+                <w:sz w:val="18"/>
+              </w:rPr>
+              <w:t>Exceso de velocidad en vías sinuosas de montaña</w:t>
+            </w:r>
+          </w:p>
+        </w:tc>
+        <w:tc>
+          <w:tcPr>
+            <w:tcW w:type="dxa" w:w="4819"/>
+            <w:shd w:fill="E8F5E9"/>
+          </w:tcPr>
+          <w:p>
+            <w:pPr>
+              <w:jc w:val="left"/>
+            </w:pPr>
+            <w:r/>
+            <w:r>
+              <w:rPr>
+                <w:rFonts w:ascii="Calibri" w:hAnsi="Calibri"/>
+                <w:sz w:val="18"/>
+              </w:rPr>
+              <w:t>Control de velocidad mediante GPS y sistema de telemetría vehicular</w:t>
+            </w:r>
+          </w:p>
+        </w:tc>
+      </w:tr>
+      <w:tr>
+        <w:tc>
+          <w:tcPr>
+            <w:tcW w:type="dxa" w:w="850"/>
+            <w:shd w:fill="FFFFFF"/>
+          </w:tcPr>
+          <w:p>
+            <w:pPr>
+              <w:jc w:val="center"/>
+            </w:pPr>
+            <w:r/>
+            <w:r>
+              <w:rPr>
+                <w:rFonts w:ascii="Calibri" w:hAnsi="Calibri"/>
+                <w:sz w:val="18"/>
+              </w:rPr>
+              <w:t>2</w:t>
+            </w:r>
+          </w:p>
+        </w:tc>
+        <w:tc>
+          <w:tcPr>
+            <w:tcW w:type="dxa" w:w="4535"/>
+            <w:shd w:fill="FFF3E0"/>
+          </w:tcPr>
+          <w:p>
+            <w:pPr>
+              <w:jc w:val="left"/>
+            </w:pPr>
+            <w:r/>
+            <w:r>
+              <w:rPr>
+                <w:rFonts w:ascii="Calibri" w:hAnsi="Calibri"/>
+                <w:sz w:val="18"/>
+              </w:rPr>
+              <w:t>Fatiga del conductor por jornadas prolongadas o turnos nocturnos</w:t>
+            </w:r>
+          </w:p>
+        </w:tc>
+        <w:tc>
+          <w:tcPr>
+            <w:tcW w:type="dxa" w:w="4819"/>
+            <w:shd w:fill="E8F5E9"/>
+          </w:tcPr>
+          <w:p>
+            <w:pPr>
+              <w:jc w:val="left"/>
+            </w:pPr>
+            <w:r/>
+            <w:r>
+              <w:rPr>
+                <w:rFonts w:ascii="Calibri" w:hAnsi="Calibri"/>
+                <w:sz w:val="18"/>
+              </w:rPr>
+              <w:t>Programa de gestión de fatiga y somnolencia (controles de alcohol, descanso obligatorio)</w:t>
+            </w:r>
+          </w:p>
+        </w:tc>
+      </w:tr>
+      <w:tr>
+        <w:tc>
+          <w:tcPr>
+            <w:tcW w:type="dxa" w:w="850"/>
+            <w:shd w:fill="FFFFFF"/>
+          </w:tcPr>
+          <w:p>
+            <w:pPr>
+              <w:jc w:val="center"/>
+            </w:pPr>
+            <w:r/>
+            <w:r>
+              <w:rPr>
+                <w:rFonts w:ascii="Calibri" w:hAnsi="Calibri"/>
+                <w:sz w:val="18"/>
+              </w:rPr>
+              <w:t>3</w:t>
+            </w:r>
+          </w:p>
+        </w:tc>
+        <w:tc>
+          <w:tcPr>
+            <w:tcW w:type="dxa" w:w="4535"/>
+            <w:shd w:fill="FFF3E0"/>
+          </w:tcPr>
+          <w:p>
+            <w:pPr>
+              <w:jc w:val="left"/>
+            </w:pPr>
+            <w:r/>
+            <w:r>
+              <w:rPr>
+                <w:rFonts w:ascii="Calibri" w:hAnsi="Calibri"/>
+                <w:sz w:val="18"/>
+              </w:rPr>
+              <w:t>Falla mecánica del sistema de frenos o dirección</w:t>
+            </w:r>
+          </w:p>
+        </w:tc>
+        <w:tc>
+          <w:tcPr>
+            <w:tcW w:type="dxa" w:w="4819"/>
+            <w:shd w:fill="E8F5E9"/>
+          </w:tcPr>
+          <w:p>
+            <w:pPr>
+              <w:jc w:val="left"/>
+            </w:pPr>
+            <w:r/>
+            <w:r>
+              <w:rPr>
+                <w:rFonts w:ascii="Calibri" w:hAnsi="Calibri"/>
+                <w:sz w:val="18"/>
+              </w:rPr>
+              <w:t>Mantenimiento preventivo según TP-PRO-MAN-001 (check-list mecánico)</w:t>
+            </w:r>
+          </w:p>
+        </w:tc>
+      </w:tr>
+      <w:tr>
+        <w:tc>
+          <w:tcPr>
+            <w:tcW w:type="dxa" w:w="850"/>
+            <w:shd w:fill="FFFFFF"/>
+          </w:tcPr>
+          <w:p>
+            <w:pPr>
+              <w:jc w:val="center"/>
+            </w:pPr>
+            <w:r/>
+            <w:r>
+              <w:rPr>
+                <w:rFonts w:ascii="Calibri" w:hAnsi="Calibri"/>
+                <w:sz w:val="18"/>
+              </w:rPr>
+              <w:t>4</w:t>
+            </w:r>
+          </w:p>
+        </w:tc>
+        <w:tc>
+          <w:tcPr>
+            <w:tcW w:type="dxa" w:w="4535"/>
+            <w:shd w:fill="FFF3E0"/>
+          </w:tcPr>
+          <w:p>
+            <w:pPr>
+              <w:jc w:val="left"/>
+            </w:pPr>
+            <w:r/>
+            <w:r>
+              <w:rPr>
+                <w:rFonts w:ascii="Calibri" w:hAnsi="Calibri"/>
+                <w:sz w:val="18"/>
+              </w:rPr>
+              <w:t>Vía en mal estado (baches, derrumbes, curvas sin señalización)</w:t>
+            </w:r>
+          </w:p>
+        </w:tc>
+        <w:tc>
+          <w:tcPr>
+            <w:tcW w:type="dxa" w:w="4819"/>
+            <w:shd w:fill="E8F5E9"/>
+          </w:tcPr>
+          <w:p>
+            <w:pPr>
+              <w:jc w:val="left"/>
+            </w:pPr>
+            <w:r/>
+            <w:r>
+              <w:rPr>
+                <w:rFonts w:ascii="Calibri" w:hAnsi="Calibri"/>
+                <w:sz w:val="18"/>
+              </w:rPr>
+              <w:t>Inspección pre-operacional diaria del vehículo (TP-FOR-SST-015)</w:t>
+            </w:r>
+          </w:p>
+        </w:tc>
+      </w:tr>
+      <w:tr>
+        <w:tc>
+          <w:tcPr>
+            <w:tcW w:type="dxa" w:w="850"/>
+            <w:shd w:fill="FFFFFF"/>
+          </w:tcPr>
+          <w:p>
+            <w:pPr>
+              <w:jc w:val="center"/>
+            </w:pPr>
+            <w:r/>
+            <w:r>
+              <w:rPr>
+                <w:rFonts w:ascii="Calibri" w:hAnsi="Calibri"/>
+                <w:sz w:val="18"/>
+              </w:rPr>
+              <w:t>5</w:t>
+            </w:r>
+          </w:p>
+        </w:tc>
+        <w:tc>
+          <w:tcPr>
+            <w:tcW w:type="dxa" w:w="4535"/>
+            <w:shd w:fill="FFF3E0"/>
+          </w:tcPr>
+          <w:p>
+            <w:pPr>
+              <w:jc w:val="left"/>
+            </w:pPr>
+            <w:r/>
+            <w:r>
+              <w:rPr>
+                <w:rFonts w:ascii="Calibri" w:hAnsi="Calibri"/>
+                <w:sz w:val="18"/>
+              </w:rPr>
+              <w:t>Sobrecarga del vehículo por encima de la capacidad permitida</w:t>
+            </w:r>
+          </w:p>
+        </w:tc>
+        <w:tc>
+          <w:tcPr>
+            <w:tcW w:type="dxa" w:w="4819"/>
+            <w:shd w:fill="E8F5E9"/>
+          </w:tcPr>
+          <w:p>
+            <w:pPr>
+              <w:jc w:val="left"/>
+            </w:pPr>
+            <w:r/>
+            <w:r>
+              <w:rPr>
+                <w:rFonts w:ascii="Calibri" w:hAnsi="Calibri"/>
+                <w:sz w:val="18"/>
+              </w:rPr>
+              <w:t>Control de carga con balanza y verificación de capacidad máxima</w:t>
+            </w:r>
+          </w:p>
+        </w:tc>
+      </w:tr>
+      <w:tr>
+        <w:tc>
+          <w:tcPr>
+            <w:tcW w:type="dxa" w:w="850"/>
+            <w:shd w:fill="FFFFFF"/>
+          </w:tcPr>
+          <w:p>
+            <w:pPr>
+              <w:jc w:val="center"/>
+            </w:pPr>
+            <w:r/>
+            <w:r>
+              <w:rPr>
+                <w:rFonts w:ascii="Calibri" w:hAnsi="Calibri"/>
+                <w:sz w:val="18"/>
+              </w:rPr>
+              <w:t>6</w:t>
+            </w:r>
+          </w:p>
+        </w:tc>
+        <w:tc>
+          <w:tcPr>
+            <w:tcW w:type="dxa" w:w="4535"/>
+            <w:shd w:fill="FFF3E0"/>
+          </w:tcPr>
+          <w:p>
+            <w:pPr>
+              <w:jc w:val="left"/>
+            </w:pPr>
+            <w:r/>
+            <w:r>
+              <w:rPr>
+                <w:rFonts w:ascii="Calibri" w:hAnsi="Calibri"/>
+                <w:sz w:val="18"/>
+              </w:rPr>
+              <w:t>Condiciones climáticas adversas (lluvia, neblina, granizo)</w:t>
+            </w:r>
+          </w:p>
+        </w:tc>
+        <w:tc>
+          <w:tcPr>
+            <w:tcW w:type="dxa" w:w="4819"/>
+            <w:shd w:fill="E8F5E9"/>
+          </w:tcPr>
+          <w:p>
+            <w:pPr>
+              <w:jc w:val="left"/>
+            </w:pPr>
+            <w:r/>
+            <w:r>
+              <w:rPr>
+                <w:rFonts w:ascii="Calibri" w:hAnsi="Calibri"/>
+                <w:sz w:val="18"/>
+              </w:rPr>
+              <w:t>Consulta de pronóstico meteorológico y suspensión preventiva de viajes</w:t>
+            </w:r>
+          </w:p>
+        </w:tc>
+      </w:tr>
+    </w:tbl>
+    <w:p/>
+    <w:p>
+      <w:pPr>
+        <w:jc w:val="center"/>
+      </w:pPr>
+      <w:r>
+        <w:rPr>
+          <w:rFonts w:ascii="Calibri" w:hAnsi="Calibri"/>
+          <w:b/>
+          <w:color w:val="C62828"/>
+          <w:sz w:val="26"/>
+        </w:rPr>
+        <w:t>▶▶▶  EVENTO PRINCIPAL: Volcadura del vehículo (volquete/cisterna)  ◀◀◀</w:t>
+      </w:r>
+    </w:p>
+    <w:p/>
+    <w:p>
+      <w:r>
+        <w:rPr>
+          <w:b/>
+        </w:rPr>
+        <w:t>LADO DERECHO — CONSECUENCIAS Y BARRERAS DE RECUPERACIÓN</w:t>
+      </w:r>
+    </w:p>
+    <w:tbl>
+      <w:tblPr>
+        <w:tblStyle w:val="TableGrid"/>
+        <w:tblW w:type="auto" w:w="0"/>
+        <w:jc w:val="center"/>
+        <w:tblLook w:firstColumn="1" w:firstRow="1" w:lastColumn="0" w:lastRow="0" w:noHBand="0" w:noVBand="1" w:val="04A0"/>
+      </w:tblPr>
+      <w:tblGrid>
+        <w:gridCol w:w="3324"/>
+        <w:gridCol w:w="3324"/>
+        <w:gridCol w:w="3324"/>
+      </w:tblGrid>
+      <w:tr>
+        <w:tc>
+          <w:tcPr>
+            <w:tcW w:type="dxa" w:w="850"/>
+            <w:shd w:fill="1A6B4E"/>
+          </w:tcPr>
+          <w:p>
+            <w:pPr>
+              <w:jc w:val="center"/>
+            </w:pPr>
+            <w:r/>
+            <w:r>
+              <w:rPr>
+                <w:rFonts w:ascii="Calibri" w:hAnsi="Calibri"/>
+                <w:b/>
+                <w:color w:val="FFFFFF"/>
+                <w:sz w:val="18"/>
+              </w:rPr>
+              <w:t>N°</w:t>
+            </w:r>
+          </w:p>
+        </w:tc>
+        <w:tc>
+          <w:tcPr>
+            <w:tcW w:type="dxa" w:w="4535"/>
+            <w:shd w:fill="1A6B4E"/>
+          </w:tcPr>
+          <w:p>
+            <w:pPr>
+              <w:jc w:val="center"/>
+            </w:pPr>
+            <w:r/>
+            <w:r>
+              <w:rPr>
+                <w:rFonts w:ascii="Calibri" w:hAnsi="Calibri"/>
+                <w:b/>
+                <w:color w:val="FFFFFF"/>
+                <w:sz w:val="18"/>
+              </w:rPr>
+              <w:t>CONSECUENCIA (Consequence)</w:t>
+            </w:r>
+          </w:p>
+        </w:tc>
+        <w:tc>
+          <w:tcPr>
+            <w:tcW w:type="dxa" w:w="4819"/>
+            <w:shd w:fill="1A6B4E"/>
+          </w:tcPr>
+          <w:p>
+            <w:pPr>
+              <w:jc w:val="center"/>
+            </w:pPr>
+            <w:r/>
+            <w:r>
+              <w:rPr>
+                <w:rFonts w:ascii="Calibri" w:hAnsi="Calibri"/>
+                <w:b/>
+                <w:color w:val="FFFFFF"/>
+                <w:sz w:val="18"/>
+              </w:rPr>
+              <w:t>BARRERA DE RECUPERACIÓN (Recovery)</w:t>
+            </w:r>
+          </w:p>
+        </w:tc>
+      </w:tr>
+      <w:tr>
+        <w:tc>
+          <w:tcPr>
+            <w:tcW w:type="dxa" w:w="850"/>
+          </w:tcPr>
+          <w:p>
+            <w:pPr>
+              <w:jc w:val="center"/>
+            </w:pPr>
+            <w:r/>
+            <w:r>
+              <w:rPr>
+                <w:rFonts w:ascii="Calibri" w:hAnsi="Calibri"/>
+                <w:sz w:val="18"/>
+              </w:rPr>
+              <w:t>1</w:t>
+            </w:r>
+          </w:p>
+        </w:tc>
+        <w:tc>
+          <w:tcPr>
+            <w:tcW w:type="dxa" w:w="4535"/>
+            <w:shd w:fill="FFEBEE"/>
+          </w:tcPr>
+          <w:p>
+            <w:pPr>
+              <w:jc w:val="left"/>
+            </w:pPr>
+            <w:r/>
+            <w:r>
+              <w:rPr>
+                <w:rFonts w:ascii="Calibri" w:hAnsi="Calibri"/>
+                <w:sz w:val="18"/>
+              </w:rPr>
+              <w:t>Muerte del conductor y/o ocupantes del vehículo</w:t>
+            </w:r>
+          </w:p>
+        </w:tc>
+        <w:tc>
+          <w:tcPr>
+            <w:tcW w:type="dxa" w:w="4819"/>
+            <w:shd w:fill="E3F2FD"/>
+          </w:tcPr>
+          <w:p>
+            <w:pPr>
+              <w:jc w:val="left"/>
+            </w:pPr>
+            <w:r/>
+            <w:r>
+              <w:rPr>
+                <w:rFonts w:ascii="Calibri" w:hAnsi="Calibri"/>
+                <w:sz w:val="18"/>
+              </w:rPr>
+              <w:t>Plan de emergencias activado (TP-PLA-SST-002) con tiempo de respuesta &lt; 15 min</w:t>
+            </w:r>
+          </w:p>
+        </w:tc>
+      </w:tr>
+      <w:tr>
+        <w:tc>
+          <w:tcPr>
+            <w:tcW w:type="dxa" w:w="850"/>
+          </w:tcPr>
+          <w:p>
+            <w:pPr>
+              <w:jc w:val="center"/>
+            </w:pPr>
+            <w:r/>
+            <w:r>
+              <w:rPr>
+                <w:rFonts w:ascii="Calibri" w:hAnsi="Calibri"/>
+                <w:sz w:val="18"/>
+              </w:rPr>
+              <w:t>2</w:t>
+            </w:r>
+          </w:p>
+        </w:tc>
+        <w:tc>
+          <w:tcPr>
+            <w:tcW w:type="dxa" w:w="4535"/>
+            <w:shd w:fill="FFEBEE"/>
+          </w:tcPr>
+          <w:p>
+            <w:pPr>
+              <w:jc w:val="left"/>
+            </w:pPr>
+            <w:r/>
+            <w:r>
+              <w:rPr>
+                <w:rFonts w:ascii="Calibri" w:hAnsi="Calibri"/>
+                <w:sz w:val="18"/>
+              </w:rPr>
+              <w:t>Lesiones graves a terceros (peatones, otros vehículos)</w:t>
+            </w:r>
+          </w:p>
+        </w:tc>
+        <w:tc>
+          <w:tcPr>
+            <w:tcW w:type="dxa" w:w="4819"/>
+            <w:shd w:fill="E3F2FD"/>
+          </w:tcPr>
+          <w:p>
+            <w:pPr>
+              <w:jc w:val="left"/>
+            </w:pPr>
+            <w:r/>
+            <w:r>
+              <w:rPr>
+                <w:rFonts w:ascii="Calibri" w:hAnsi="Calibri"/>
+                <w:sz w:val="18"/>
+              </w:rPr>
+              <w:t>Kit de contención de derrames en cada unidad vehicular</w:t>
+            </w:r>
+          </w:p>
+        </w:tc>
+      </w:tr>
+      <w:tr>
+        <w:tc>
+          <w:tcPr>
+            <w:tcW w:type="dxa" w:w="850"/>
+          </w:tcPr>
+          <w:p>
+            <w:pPr>
+              <w:jc w:val="center"/>
+            </w:pPr>
+            <w:r/>
+            <w:r>
+              <w:rPr>
+                <w:rFonts w:ascii="Calibri" w:hAnsi="Calibri"/>
+                <w:sz w:val="18"/>
+              </w:rPr>
+              <w:t>3</w:t>
+            </w:r>
+          </w:p>
+        </w:tc>
+        <w:tc>
+          <w:tcPr>
+            <w:tcW w:type="dxa" w:w="4535"/>
+            <w:shd w:fill="FFEBEE"/>
+          </w:tcPr>
+          <w:p>
+            <w:pPr>
+              <w:jc w:val="left"/>
+            </w:pPr>
+            <w:r/>
+            <w:r>
+              <w:rPr>
+                <w:rFonts w:ascii="Calibri" w:hAnsi="Calibri"/>
+                <w:sz w:val="18"/>
+              </w:rPr>
+              <w:t>Derrame de combustible o carga peligrosa al medio ambiente</w:t>
+            </w:r>
+          </w:p>
+        </w:tc>
+        <w:tc>
+          <w:tcPr>
+            <w:tcW w:type="dxa" w:w="4819"/>
+            <w:shd w:fill="E3F2FD"/>
+          </w:tcPr>
+          <w:p>
+            <w:pPr>
+              <w:jc w:val="left"/>
+            </w:pPr>
+            <w:r/>
+            <w:r>
+              <w:rPr>
+                <w:rFonts w:ascii="Calibri" w:hAnsi="Calibri"/>
+                <w:sz w:val="18"/>
+              </w:rPr>
+              <w:t>Brigada de emergencia capacitada y equipada en obra</w:t>
+            </w:r>
+          </w:p>
+        </w:tc>
+      </w:tr>
+      <w:tr>
+        <w:tc>
+          <w:tcPr>
+            <w:tcW w:type="dxa" w:w="850"/>
+          </w:tcPr>
+          <w:p>
+            <w:pPr>
+              <w:jc w:val="center"/>
+            </w:pPr>
+            <w:r/>
+            <w:r>
+              <w:rPr>
+                <w:rFonts w:ascii="Calibri" w:hAnsi="Calibri"/>
+                <w:sz w:val="18"/>
+              </w:rPr>
+              <w:t>4</w:t>
+            </w:r>
+          </w:p>
+        </w:tc>
+        <w:tc>
+          <w:tcPr>
+            <w:tcW w:type="dxa" w:w="4535"/>
+            <w:shd w:fill="FFEBEE"/>
+          </w:tcPr>
+          <w:p>
+            <w:pPr>
+              <w:jc w:val="left"/>
+            </w:pPr>
+            <w:r/>
+            <w:r>
+              <w:rPr>
+                <w:rFonts w:ascii="Calibri" w:hAnsi="Calibri"/>
+                <w:sz w:val="18"/>
+              </w:rPr>
+              <w:t>Daño ambiental significativo (contaminación de suelo y agua)</w:t>
+            </w:r>
+          </w:p>
+        </w:tc>
+        <w:tc>
+          <w:tcPr>
+            <w:tcW w:type="dxa" w:w="4819"/>
+            <w:shd w:fill="E3F2FD"/>
+          </w:tcPr>
+          <w:p>
+            <w:pPr>
+              <w:jc w:val="left"/>
+            </w:pPr>
+            <w:r/>
+            <w:r>
+              <w:rPr>
+                <w:rFonts w:ascii="Calibri" w:hAnsi="Calibri"/>
+                <w:sz w:val="18"/>
+              </w:rPr>
+              <w:t>Seguro SCTR vigente para todos los trabajadores expuestos</w:t>
+            </w:r>
+          </w:p>
+        </w:tc>
+      </w:tr>
+      <w:tr>
+        <w:tc>
+          <w:tcPr>
+            <w:tcW w:type="dxa" w:w="850"/>
+          </w:tcPr>
+          <w:p>
+            <w:pPr>
+              <w:jc w:val="center"/>
+            </w:pPr>
+            <w:r/>
+            <w:r>
+              <w:rPr>
+                <w:rFonts w:ascii="Calibri" w:hAnsi="Calibri"/>
+                <w:sz w:val="18"/>
+              </w:rPr>
+              <w:t>5</w:t>
+            </w:r>
+          </w:p>
+        </w:tc>
+        <w:tc>
+          <w:tcPr>
+            <w:tcW w:type="dxa" w:w="4535"/>
+            <w:shd w:fill="FFEBEE"/>
+          </w:tcPr>
+          <w:p>
+            <w:pPr>
+              <w:jc w:val="left"/>
+            </w:pPr>
+            <w:r/>
+            <w:r>
+              <w:rPr>
+                <w:rFonts w:ascii="Calibri" w:hAnsi="Calibri"/>
+                <w:sz w:val="18"/>
+              </w:rPr>
+              <w:t>Paralización del proyecto CSF Hanaqpampa</w:t>
+            </w:r>
+          </w:p>
+        </w:tc>
+        <w:tc>
+          <w:tcPr>
+            <w:tcW w:type="dxa" w:w="4819"/>
+            <w:shd w:fill="E3F2FD"/>
+          </w:tcPr>
+          <w:p>
+            <w:pPr>
+              <w:jc w:val="left"/>
+            </w:pPr>
+            <w:r/>
+            <w:r>
+              <w:rPr>
+                <w:rFonts w:ascii="Calibri" w:hAnsi="Calibri"/>
+                <w:sz w:val="18"/>
+              </w:rPr>
+              <w:t>Protocolo de notificación inmediata a ENGIE (&lt; 1 hora)</w:t>
+            </w:r>
+          </w:p>
+        </w:tc>
+      </w:tr>
+      <w:tr>
+        <w:tc>
+          <w:tcPr>
+            <w:tcW w:type="dxa" w:w="850"/>
+          </w:tcPr>
+          <w:p>
+            <w:pPr>
+              <w:jc w:val="center"/>
+            </w:pPr>
+            <w:r/>
+            <w:r>
+              <w:rPr>
+                <w:rFonts w:ascii="Calibri" w:hAnsi="Calibri"/>
+                <w:sz w:val="18"/>
+              </w:rPr>
+              <w:t>6</w:t>
+            </w:r>
+          </w:p>
+        </w:tc>
+        <w:tc>
+          <w:tcPr>
+            <w:tcW w:type="dxa" w:w="4535"/>
+            <w:shd w:fill="FFEBEE"/>
+          </w:tcPr>
+          <w:p>
+            <w:pPr>
+              <w:jc w:val="left"/>
+            </w:pPr>
+            <w:r/>
+            <w:r>
+              <w:rPr>
+                <w:rFonts w:ascii="Calibri" w:hAnsi="Calibri"/>
+                <w:sz w:val="18"/>
+              </w:rPr>
+              <w:t>Sanciones de OSINERGMIN y procesos penales</w:t>
+            </w:r>
+          </w:p>
+        </w:tc>
+        <w:tc>
+          <w:tcPr>
+            <w:tcW w:type="dxa" w:w="4819"/>
+          </w:tcPr>
+          <w:p/>
+        </w:tc>
+      </w:tr>
+    </w:tbl>
+    <w:p/>
+    <w:p>
+      <w:r>
+        <w:rPr>
+          <w:b/>
+        </w:rPr>
+        <w:t>FACTORES DE ESCALAMIENTO (Escalation Factors)</w:t>
+      </w:r>
+    </w:p>
+    <w:tbl>
+      <w:tblPr>
+        <w:tblStyle w:val="TableGrid"/>
+        <w:tblW w:type="auto" w:w="0"/>
+        <w:jc w:val="center"/>
+        <w:tblLook w:firstColumn="1" w:firstRow="1" w:lastColumn="0" w:lastRow="0" w:noHBand="0" w:noVBand="1" w:val="04A0"/>
+      </w:tblPr>
+      <w:tblGrid>
+        <w:gridCol w:w="3324"/>
+        <w:gridCol w:w="3324"/>
+        <w:gridCol w:w="3324"/>
+      </w:tblGrid>
+      <w:tr>
+        <w:tc>
+          <w:tcPr>
+            <w:tcW w:type="dxa" w:w="850"/>
+            <w:shd w:fill="1A6B4E"/>
+          </w:tcPr>
+          <w:p>
+            <w:pPr>
+              <w:jc w:val="center"/>
+            </w:pPr>
+            <w:r/>
+            <w:r>
+              <w:rPr>
+                <w:rFonts w:ascii="Calibri" w:hAnsi="Calibri"/>
+                <w:b/>
+                <w:color w:val="FFFFFF"/>
+                <w:sz w:val="18"/>
+              </w:rPr>
+              <w:t>N°</w:t>
+            </w:r>
+          </w:p>
+        </w:tc>
+        <w:tc>
+          <w:tcPr>
+            <w:tcW w:type="dxa" w:w="4535"/>
+            <w:shd w:fill="1A6B4E"/>
+          </w:tcPr>
+          <w:p>
+            <w:pPr>
+              <w:jc w:val="center"/>
+            </w:pPr>
+            <w:r/>
+            <w:r>
+              <w:rPr>
+                <w:rFonts w:ascii="Calibri" w:hAnsi="Calibri"/>
+                <w:b/>
+                <w:color w:val="FFFFFF"/>
+                <w:sz w:val="18"/>
+              </w:rPr>
+              <w:t>FACTOR DE ESCALAMIENTO</w:t>
+            </w:r>
+          </w:p>
+        </w:tc>
+        <w:tc>
+          <w:tcPr>
+            <w:tcW w:type="dxa" w:w="4819"/>
+            <w:shd w:fill="1A6B4E"/>
+          </w:tcPr>
+          <w:p>
+            <w:pPr>
+              <w:jc w:val="center"/>
+            </w:pPr>
+            <w:r/>
+            <w:r>
+              <w:rPr>
+                <w:rFonts w:ascii="Calibri" w:hAnsi="Calibri"/>
+                <w:b/>
+                <w:color w:val="FFFFFF"/>
+                <w:sz w:val="18"/>
+              </w:rPr>
+              <w:t>CONTROL DE ESCALAMIENTO</w:t>
+            </w:r>
+          </w:p>
+        </w:tc>
+      </w:tr>
+      <w:tr>
+        <w:tc>
+          <w:tcPr>
+            <w:tcW w:type="dxa" w:w="850"/>
+          </w:tcPr>
+          <w:p>
+            <w:pPr>
+              <w:jc w:val="center"/>
+            </w:pPr>
+            <w:r/>
+            <w:r>
+              <w:rPr>
+                <w:rFonts w:ascii="Calibri" w:hAnsi="Calibri"/>
+                <w:sz w:val="18"/>
+              </w:rPr>
+              <w:t>1</w:t>
+            </w:r>
+          </w:p>
+        </w:tc>
+        <w:tc>
+          <w:tcPr>
+            <w:tcW w:type="dxa" w:w="4535"/>
+            <w:shd w:fill="FFFDE7"/>
+          </w:tcPr>
+          <w:p>
+            <w:pPr>
+              <w:jc w:val="left"/>
+            </w:pPr>
+            <w:r/>
+            <w:r>
+              <w:rPr>
+                <w:rFonts w:ascii="Calibri" w:hAnsi="Calibri"/>
+                <w:sz w:val="18"/>
+              </w:rPr>
+              <w:t>Vehículo sin mantenimiento por presión de cronograma</w:t>
+            </w:r>
+          </w:p>
+        </w:tc>
+        <w:tc>
+          <w:tcPr>
+            <w:tcW w:type="dxa" w:w="4819"/>
+            <w:shd w:fill="F3E5F5"/>
+          </w:tcPr>
+          <w:p>
+            <w:pPr>
+              <w:jc w:val="left"/>
+            </w:pPr>
+            <w:r/>
+            <w:r>
+              <w:rPr>
+                <w:rFonts w:ascii="Calibri" w:hAnsi="Calibri"/>
+                <w:sz w:val="18"/>
+              </w:rPr>
+              <w:t>Programa de mantenimiento obligatorio con parada programada</w:t>
+            </w:r>
+          </w:p>
+        </w:tc>
+      </w:tr>
+      <w:tr>
+        <w:tc>
+          <w:tcPr>
+            <w:tcW w:type="dxa" w:w="850"/>
+          </w:tcPr>
+          <w:p>
+            <w:pPr>
+              <w:jc w:val="center"/>
+            </w:pPr>
+            <w:r/>
+            <w:r>
+              <w:rPr>
+                <w:rFonts w:ascii="Calibri" w:hAnsi="Calibri"/>
+                <w:sz w:val="18"/>
+              </w:rPr>
+              <w:t>2</w:t>
+            </w:r>
+          </w:p>
+        </w:tc>
+        <w:tc>
+          <w:tcPr>
+            <w:tcW w:type="dxa" w:w="4535"/>
+            <w:shd w:fill="FFFDE7"/>
+          </w:tcPr>
+          <w:p>
+            <w:pPr>
+              <w:jc w:val="left"/>
+            </w:pPr>
+            <w:r/>
+            <w:r>
+              <w:rPr>
+                <w:rFonts w:ascii="Calibri" w:hAnsi="Calibri"/>
+                <w:sz w:val="18"/>
+              </w:rPr>
+              <w:t>Conductor sin descanso adecuado por falta de relevo</w:t>
+            </w:r>
+          </w:p>
+        </w:tc>
+        <w:tc>
+          <w:tcPr>
+            <w:tcW w:type="dxa" w:w="4819"/>
+            <w:shd w:fill="F3E5F5"/>
+          </w:tcPr>
+          <w:p>
+            <w:pPr>
+              <w:jc w:val="left"/>
+            </w:pPr>
+            <w:r/>
+            <w:r>
+              <w:rPr>
+                <w:rFonts w:ascii="Calibri" w:hAnsi="Calibri"/>
+                <w:sz w:val="18"/>
+              </w:rPr>
+              <w:t>Dotación de conductores de relevo y control de horas de manejo</w:t>
+            </w:r>
+          </w:p>
+        </w:tc>
+      </w:tr>
+      <w:tr>
+        <w:tc>
+          <w:tcPr>
+            <w:tcW w:type="dxa" w:w="850"/>
+          </w:tcPr>
+          <w:p>
+            <w:pPr>
+              <w:jc w:val="center"/>
+            </w:pPr>
+            <w:r/>
+            <w:r>
+              <w:rPr>
+                <w:rFonts w:ascii="Calibri" w:hAnsi="Calibri"/>
+                <w:sz w:val="18"/>
+              </w:rPr>
+              <w:t>3</w:t>
+            </w:r>
+          </w:p>
+        </w:tc>
+        <w:tc>
+          <w:tcPr>
+            <w:tcW w:type="dxa" w:w="4535"/>
+            <w:shd w:fill="FFFDE7"/>
+          </w:tcPr>
+          <w:p>
+            <w:pPr>
+              <w:jc w:val="left"/>
+            </w:pPr>
+            <w:r/>
+            <w:r>
+              <w:rPr>
+                <w:rFonts w:ascii="Calibri" w:hAnsi="Calibri"/>
+                <w:sz w:val="18"/>
+              </w:rPr>
+              <w:t>Ruta sin señalización ni evaluación previa</w:t>
+            </w:r>
+          </w:p>
+        </w:tc>
+        <w:tc>
+          <w:tcPr>
+            <w:tcW w:type="dxa" w:w="4819"/>
+            <w:shd w:fill="F3E5F5"/>
+          </w:tcPr>
+          <w:p>
+            <w:pPr>
+              <w:jc w:val="left"/>
+            </w:pPr>
+            <w:r/>
+            <w:r>
+              <w:rPr>
+                <w:rFonts w:ascii="Calibri" w:hAnsi="Calibri"/>
+                <w:sz w:val="18"/>
+              </w:rPr>
+              <w:t>Evaluación de ruta documentada y señalización temporal</w:t>
+            </w:r>
+          </w:p>
+        </w:tc>
+      </w:tr>
+      <w:tr>
+        <w:tc>
+          <w:tcPr>
+            <w:tcW w:type="dxa" w:w="850"/>
+          </w:tcPr>
+          <w:p>
+            <w:pPr>
+              <w:jc w:val="center"/>
+            </w:pPr>
+            <w:r/>
+            <w:r>
+              <w:rPr>
+                <w:rFonts w:ascii="Calibri" w:hAnsi="Calibri"/>
+                <w:sz w:val="18"/>
+              </w:rPr>
+              <w:t>4</w:t>
+            </w:r>
+          </w:p>
+        </w:tc>
+        <w:tc>
+          <w:tcPr>
+            <w:tcW w:type="dxa" w:w="4535"/>
+            <w:shd w:fill="FFFDE7"/>
+          </w:tcPr>
+          <w:p>
+            <w:pPr>
+              <w:jc w:val="left"/>
+            </w:pPr>
+            <w:r/>
+            <w:r>
+              <w:rPr>
+                <w:rFonts w:ascii="Calibri" w:hAnsi="Calibri"/>
+                <w:sz w:val="18"/>
+              </w:rPr>
+              <w:t>Demora en activación de emergencia por zona sin cobertura</w:t>
+            </w:r>
+          </w:p>
+        </w:tc>
+        <w:tc>
+          <w:tcPr>
+            <w:tcW w:type="dxa" w:w="4819"/>
+            <w:shd w:fill="F3E5F5"/>
+          </w:tcPr>
+          <w:p>
+            <w:pPr>
+              <w:jc w:val="left"/>
+            </w:pPr>
+            <w:r/>
+            <w:r>
+              <w:rPr>
+                <w:rFonts w:ascii="Calibri" w:hAnsi="Calibri"/>
+                <w:sz w:val="18"/>
+              </w:rPr>
+              <w:t>Radio de comunicación HF y puntos de comunicación satelital</w:t>
+            </w:r>
+          </w:p>
+        </w:tc>
+      </w:tr>
+      <w:tr>
+        <w:tc>
+          <w:tcPr>
+            <w:tcW w:type="dxa" w:w="850"/>
+          </w:tcPr>
+          <w:p>
+            <w:pPr>
+              <w:jc w:val="center"/>
+            </w:pPr>
+            <w:r/>
+            <w:r>
+              <w:rPr>
+                <w:rFonts w:ascii="Calibri" w:hAnsi="Calibri"/>
+                <w:sz w:val="18"/>
+              </w:rPr>
+              <w:t>5</w:t>
+            </w:r>
+          </w:p>
+        </w:tc>
+        <w:tc>
+          <w:tcPr>
+            <w:tcW w:type="dxa" w:w="4535"/>
+            <w:shd w:fill="FFFDE7"/>
+          </w:tcPr>
+          <w:p>
+            <w:pPr>
+              <w:jc w:val="left"/>
+            </w:pPr>
+            <w:r/>
+            <w:r>
+              <w:rPr>
+                <w:rFonts w:ascii="Calibri" w:hAnsi="Calibri"/>
+                <w:sz w:val="18"/>
+              </w:rPr>
+              <w:t>Falta de equipo de contención en la unidad</w:t>
+            </w:r>
+          </w:p>
+        </w:tc>
+        <w:tc>
+          <w:tcPr>
+            <w:tcW w:type="dxa" w:w="4819"/>
+            <w:shd w:fill="F3E5F5"/>
+          </w:tcPr>
+          <w:p>
+            <w:pPr>
+              <w:jc w:val="left"/>
+            </w:pPr>
+            <w:r/>
+            <w:r>
+              <w:rPr>
+                <w:rFonts w:ascii="Calibri" w:hAnsi="Calibri"/>
+                <w:sz w:val="18"/>
+              </w:rPr>
+              <w:t>Inspección semanal de kit antiderrame con check-list</w:t>
+            </w:r>
+          </w:p>
+        </w:tc>
+      </w:tr>
+    </w:tbl>
+    <w:p>
+      <w:pPr>
+        <w:pStyle w:val="Heading2"/>
+      </w:pPr>
+      <w:r>
+        <w:rPr>
+          <w:rFonts w:ascii="Calibri" w:hAnsi="Calibri"/>
+        </w:rPr>
+        <w:t>5. Responsabilidades</w:t>
+      </w:r>
+    </w:p>
+    <w:tbl>
+      <w:tblPr>
+        <w:tblStyle w:val="TableGrid"/>
+        <w:tblW w:type="auto" w:w="0"/>
+        <w:jc w:val="center"/>
+        <w:tblLook w:firstColumn="1" w:firstRow="1" w:lastColumn="0" w:lastRow="0" w:noHBand="0" w:noVBand="1" w:val="04A0"/>
+      </w:tblPr>
+      <w:tblGrid>
+        <w:gridCol w:w="4986"/>
+        <w:gridCol w:w="4986"/>
+      </w:tblGrid>
+      <w:tr>
+        <w:tc>
+          <w:tcPr>
+            <w:tcW w:type="dxa" w:w="4986"/>
+            <w:shd w:fill="1A6B4E"/>
+          </w:tcPr>
+          <w:p>
+            <w:pPr>
+              <w:jc w:val="center"/>
+            </w:pPr>
+            <w:r/>
+            <w:r>
+              <w:rPr>
+                <w:rFonts w:ascii="Calibri" w:hAnsi="Calibri"/>
+                <w:b/>
+                <w:color w:val="FFFFFF"/>
+                <w:sz w:val="20"/>
+              </w:rPr>
+              <w:t>ROL</w:t>
+            </w:r>
+          </w:p>
+        </w:tc>
+        <w:tc>
+          <w:tcPr>
+            <w:tcW w:type="dxa" w:w="4986"/>
+            <w:shd w:fill="1A6B4E"/>
+          </w:tcPr>
+          <w:p>
+            <w:pPr>
+              <w:jc w:val="center"/>
+            </w:pPr>
+            <w:r/>
+            <w:r>
+              <w:rPr>
+                <w:rFonts w:ascii="Calibri" w:hAnsi="Calibri"/>
+                <w:b/>
+                <w:color w:val="FFFFFF"/>
+                <w:sz w:val="20"/>
+              </w:rPr>
+              <w:t>RESPONSABILIDAD</w:t>
+            </w:r>
+          </w:p>
+        </w:tc>
+      </w:tr>
+      <w:tr>
+        <w:tc>
+          <w:tcPr>
+            <w:tcW w:type="dxa" w:w="4986"/>
+          </w:tcPr>
+          <w:p>
+            <w:pPr>
+              <w:jc w:val="left"/>
+            </w:pPr>
+            <w:r/>
+            <w:r>
+              <w:rPr>
+                <w:rFonts w:ascii="Calibri" w:hAnsi="Calibri"/>
+                <w:b/>
+                <w:sz w:val="20"/>
+              </w:rPr>
+              <w:t>Gerente General</w:t>
+            </w:r>
+          </w:p>
+        </w:tc>
+        <w:tc>
+          <w:tcPr>
+            <w:tcW w:type="dxa" w:w="4986"/>
+          </w:tcPr>
+          <w:p>
+            <w:pPr>
+              <w:jc w:val="left"/>
+            </w:pPr>
+            <w:r/>
+            <w:r>
+              <w:rPr>
+                <w:rFonts w:ascii="Calibri" w:hAnsi="Calibri"/>
+                <w:sz w:val="20"/>
+              </w:rPr>
+              <w:t>Asegurar recursos para la implementación de barreras de control.</w:t>
+            </w:r>
+          </w:p>
+        </w:tc>
+      </w:tr>
+      <w:tr>
+        <w:tc>
+          <w:tcPr>
+            <w:tcW w:type="dxa" w:w="4986"/>
+          </w:tcPr>
+          <w:p>
+            <w:pPr>
+              <w:jc w:val="left"/>
+            </w:pPr>
+            <w:r/>
+            <w:r>
+              <w:rPr>
+                <w:rFonts w:ascii="Calibri" w:hAnsi="Calibri"/>
+                <w:b/>
+                <w:sz w:val="20"/>
+              </w:rPr>
+              <w:t>Supervisor SST</w:t>
+            </w:r>
+          </w:p>
+        </w:tc>
+        <w:tc>
+          <w:tcPr>
+            <w:tcW w:type="dxa" w:w="4986"/>
+          </w:tcPr>
+          <w:p>
+            <w:pPr>
+              <w:jc w:val="left"/>
+            </w:pPr>
+            <w:r/>
+            <w:r>
+              <w:rPr>
+                <w:rFonts w:ascii="Calibri" w:hAnsi="Calibri"/>
+                <w:sz w:val="20"/>
+              </w:rPr>
+              <w:t>Verificar la implementación y eficacia de las barreras preventivas y de recuperación.</w:t>
+            </w:r>
+          </w:p>
+        </w:tc>
+      </w:tr>
+      <w:tr>
+        <w:tc>
+          <w:tcPr>
+            <w:tcW w:type="dxa" w:w="4986"/>
+          </w:tcPr>
+          <w:p>
+            <w:pPr>
+              <w:jc w:val="left"/>
+            </w:pPr>
+            <w:r/>
+            <w:r>
+              <w:rPr>
+                <w:rFonts w:ascii="Calibri" w:hAnsi="Calibri"/>
+                <w:b/>
+                <w:sz w:val="20"/>
+              </w:rPr>
+              <w:t>Trabajadores</w:t>
+            </w:r>
+          </w:p>
+        </w:tc>
+        <w:tc>
+          <w:tcPr>
+            <w:tcW w:type="dxa" w:w="4986"/>
+          </w:tcPr>
+          <w:p>
+            <w:pPr>
+              <w:jc w:val="left"/>
+            </w:pPr>
+            <w:r/>
+            <w:r>
+              <w:rPr>
+                <w:rFonts w:ascii="Calibri" w:hAnsi="Calibri"/>
+                <w:sz w:val="20"/>
+              </w:rPr>
+              <w:t>Cumplir con los procedimientos establecidos y reportar condiciones subestándar.</w:t>
+            </w:r>
+          </w:p>
+        </w:tc>
+      </w:tr>
+      <w:tr>
+        <w:tc>
+          <w:tcPr>
+            <w:tcW w:type="dxa" w:w="4986"/>
+          </w:tcPr>
+          <w:p>
+            <w:pPr>
+              <w:jc w:val="left"/>
+            </w:pPr>
+            <w:r/>
+            <w:r>
+              <w:rPr>
+                <w:rFonts w:ascii="Calibri" w:hAnsi="Calibri"/>
+                <w:b/>
+                <w:sz w:val="20"/>
+              </w:rPr>
+              <w:t>INNOVAQ SOLUTIONS</w:t>
+            </w:r>
+          </w:p>
+        </w:tc>
+        <w:tc>
+          <w:tcPr>
+            <w:tcW w:type="dxa" w:w="4986"/>
+          </w:tcPr>
+          <w:p>
+            <w:pPr>
+              <w:jc w:val="left"/>
+            </w:pPr>
+            <w:r/>
+            <w:r>
+              <w:rPr>
+                <w:rFonts w:ascii="Calibri" w:hAnsi="Calibri"/>
+                <w:sz w:val="20"/>
+              </w:rPr>
+              <w:t>Asesorar en la identificación de riesgos y diseño de barreras de control.</w:t>
+            </w:r>
+          </w:p>
+        </w:tc>
+      </w:tr>
+    </w:tbl>
+    <w:p>
+      <w:pPr>
+        <w:pStyle w:val="Heading2"/>
+      </w:pPr>
+      <w:r>
+        <w:rPr>
+          <w:rFonts w:ascii="Calibri" w:hAnsi="Calibri"/>
+        </w:rPr>
+        <w:t>6. Referencias Normativas</w:t>
       </w:r>
     </w:p>
     <w:p>
       <w:r>
-        <w:t>Controles que previenen que las amenazas causen el evento tope:</w:t>
+        <w:rPr>
+          <w:rFonts w:ascii="Calibri" w:hAnsi="Calibri"/>
+          <w:sz w:val="20"/>
+        </w:rPr>
+        <w:t>• Ley 29783 — Ley de Seguridad y Salud en el Trabajo</w:t>
       </w:r>
     </w:p>
     <w:p>
-      <w:pPr>
-        <w:pStyle w:val="ListBullet"/>
-      </w:pPr>
       <w:r>
-        <w:t>✓ Control de velocidad GPS con alertas en tiempo real</w:t>
+        <w:rPr>
+          <w:rFonts w:ascii="Calibri" w:hAnsi="Calibri"/>
+          <w:sz w:val="20"/>
+        </w:rPr>
+        <w:t>• DS 005-2012-TR — Reglamento de la Ley 29783</w:t>
       </w:r>
     </w:p>
     <w:p>
-      <w:pPr>
-        <w:pStyle w:val="ListBullet"/>
-      </w:pPr>
       <w:r>
-        <w:t>✓ Programa de gestión de fatiga y somnolencia (TP-PRO-SST-004)</w:t>
+        <w:rPr>
+          <w:rFonts w:ascii="Calibri" w:hAnsi="Calibri"/>
+          <w:sz w:val="20"/>
+        </w:rPr>
+        <w:t>• ISO 45001:2018 — Sistemas de Gestión de Seguridad y Salud en el Trabajo</w:t>
       </w:r>
     </w:p>
     <w:p>
-      <w:pPr>
-        <w:pStyle w:val="ListBullet"/>
-      </w:pPr>
       <w:r>
-        <w:t>✓ Mantenimiento preventivo de flota (TP-PRO-MAN-001)</w:t>
+        <w:rPr>
+          <w:rFonts w:ascii="Calibri" w:hAnsi="Calibri"/>
+          <w:sz w:val="20"/>
+        </w:rPr>
+        <w:t>• ISO 14001:2015 — Sistemas de Gestión Ambiental</w:t>
       </w:r>
     </w:p>
     <w:p>
-      <w:pPr>
-        <w:pStyle w:val="ListBullet"/>
-      </w:pPr>
       <w:r>
-        <w:t>✓ Inspección pre-operacional diaria (Check-list vehicular)</w:t>
+        <w:rPr>
+          <w:rFonts w:ascii="Calibri" w:hAnsi="Calibri"/>
+          <w:sz w:val="20"/>
+        </w:rPr>
+        <w:t>• RM 050-2013-TR — Formatos referenciales de SST</w:t>
       </w:r>
     </w:p>
     <w:p>
-      <w:pPr>
-        <w:pStyle w:val="ListBullet"/>
-      </w:pPr>
       <w:r>
-        <w:t>✓ Control de carga: pesaje y amarre certificado</w:t>
-      </w:r>
-    </w:p>
-    <w:p>
-      <w:pPr>
-        <w:pStyle w:val="ListBullet"/>
-      </w:pPr>
-      <w:r>
-        <w:t>✓ Consulta de pronóstico meteorológico antes de salida</w:t>
+        <w:rPr>
+          <w:rFonts w:ascii="Calibri" w:hAnsi="Calibri"/>
+          <w:sz w:val="20"/>
+        </w:rPr>
+        <w:t>• Estándares ENGIE — Requisitos de seguridad para contratistas</w:t>
       </w:r>
     </w:p>
     <w:p>
@@ -331,204 +2141,189 @@
         <w:pStyle w:val="Heading2"/>
       </w:pPr>
       <w:r>
-        <w:t>5. CONSECUENCIAS (Consequences) — Lado Derecho</w:t>
+        <w:rPr>
+          <w:rFonts w:ascii="Calibri" w:hAnsi="Calibri"/>
+        </w:rPr>
+        <w:t>7. Control de Cambios</w:t>
       </w:r>
     </w:p>
-    <w:p>
-      <w:pPr>
-        <w:pStyle w:val="ListBullet"/>
-      </w:pPr>
-      <w:r>
-        <w:t>Muerte del conductor y/o ocupantes</w:t>
-      </w:r>
-    </w:p>
-    <w:p>
-      <w:pPr>
-        <w:pStyle w:val="ListBullet"/>
-      </w:pPr>
-      <w:r>
-        <w:t>Lesiones graves a terceros en la vía</w:t>
-      </w:r>
-    </w:p>
-    <w:p>
-      <w:pPr>
-        <w:pStyle w:val="ListBullet"/>
-      </w:pPr>
-      <w:r>
-        <w:t>Derrame de combustible o carga peligrosa</w:t>
-      </w:r>
-    </w:p>
-    <w:p>
-      <w:pPr>
-        <w:pStyle w:val="ListBullet"/>
-      </w:pPr>
-      <w:r>
-        <w:t>Contaminación ambiental de suelo y agua</w:t>
-      </w:r>
-    </w:p>
-    <w:p>
-      <w:pPr>
-        <w:pStyle w:val="ListBullet"/>
-      </w:pPr>
-      <w:r>
-        <w:t>Paralización del proyecto CSF Hanaqpampa</w:t>
-      </w:r>
-    </w:p>
-    <w:p>
-      <w:pPr>
-        <w:pStyle w:val="ListBullet"/>
-      </w:pPr>
-      <w:r>
-        <w:t>Sanciones de OSINERGMIN / SUTRAN / SUNAFIL</w:t>
-      </w:r>
-    </w:p>
-    <w:p>
-      <w:pPr>
-        <w:pStyle w:val="ListBullet"/>
-      </w:pPr>
-      <w:r>
-        <w:t>Pérdida de homologación ENGIE</w:t>
-      </w:r>
-    </w:p>
-    <w:p>
-      <w:pPr>
-        <w:pStyle w:val="Heading2"/>
-      </w:pPr>
-      <w:r>
-        <w:t>6. BARRERAS DE RECUPERACIÓN (Mitigation)</w:t>
-      </w:r>
-    </w:p>
-    <w:p>
-      <w:r>
-        <w:t>Controles que mitigan las consecuencias después del evento tope:</w:t>
-      </w:r>
-    </w:p>
-    <w:p>
-      <w:pPr>
-        <w:pStyle w:val="ListBullet"/>
-      </w:pPr>
-      <w:r>
-        <w:t>✓ Plan de emergencias activado (TP-PLA-SST-002)</w:t>
-      </w:r>
-    </w:p>
-    <w:p>
-      <w:pPr>
-        <w:pStyle w:val="ListBullet"/>
-      </w:pPr>
-      <w:r>
-        <w:t>✓ Kit de contención de derrames en cada unidad</w:t>
-      </w:r>
-    </w:p>
-    <w:p>
-      <w:pPr>
-        <w:pStyle w:val="ListBullet"/>
-      </w:pPr>
-      <w:r>
-        <w:t>✓ Brigada de emergencia con tiempo de respuesta &lt; 30 min</w:t>
-      </w:r>
-    </w:p>
-    <w:p>
-      <w:pPr>
-        <w:pStyle w:val="ListBullet"/>
-      </w:pPr>
-      <w:r>
-        <w:t>✓ Seguro SCTR activo para todo el personal</w:t>
-      </w:r>
-    </w:p>
-    <w:p>
-      <w:pPr>
-        <w:pStyle w:val="ListBullet"/>
-      </w:pPr>
-      <w:r>
-        <w:t>✓ Protocolo de notificación a ENGIE en &lt; 2 horas</w:t>
-      </w:r>
-    </w:p>
-    <w:p>
-      <w:pPr>
-        <w:pStyle w:val="ListBullet"/>
-      </w:pPr>
-      <w:r>
-        <w:t>✓ Investigación ICAM dentro de 48 horas</w:t>
-      </w:r>
-    </w:p>
-    <w:p>
-      <w:pPr>
-        <w:pStyle w:val="Heading2"/>
-      </w:pPr>
-      <w:r>
-        <w:t>7. FACTORES DE ESCALAMIENTO</w:t>
-      </w:r>
-    </w:p>
-    <w:p>
-      <w:r>
-        <w:t>Factores que pueden degradar la efectividad de las barreras:</w:t>
-      </w:r>
-    </w:p>
-    <w:p>
-      <w:pPr>
-        <w:pStyle w:val="ListBullet"/>
-      </w:pPr>
-      <w:r>
-        <w:t>⚠ Conductor no capacitado en manejo defensivo</w:t>
-      </w:r>
-    </w:p>
-    <w:p>
-      <w:pPr>
-        <w:pStyle w:val="ListBullet"/>
-      </w:pPr>
-      <w:r>
-        <w:t>⚠ Falta de supervisión en ruta</w:t>
-      </w:r>
-    </w:p>
-    <w:p>
-      <w:pPr>
-        <w:pStyle w:val="ListBullet"/>
-      </w:pPr>
-      <w:r>
-        <w:t>⚠ Ruta alternativa no evaluada previamente</w:t>
-      </w:r>
-    </w:p>
-    <w:p>
-      <w:pPr>
-        <w:pStyle w:val="ListBullet"/>
-      </w:pPr>
-      <w:r>
-        <w:t>⚠ Kit de emergencia incompleto o vencido</w:t>
-      </w:r>
-    </w:p>
-    <w:p>
-      <w:pPr>
-        <w:pStyle w:val="Heading2"/>
-      </w:pPr>
-      <w:r>
-        <w:t>8. DIAGRAMA BOW-TIE</w:t>
-      </w:r>
-    </w:p>
-    <w:p>
-      <w:r>
-        <w:t>AMENAZAS → [BARRERAS PREVENTIVAS] → EVENTO TOPE → [BARRERAS DE RECUPERACIÓN] → CONSECUENCIAS</w:t>
-        <w:br/>
-        <w:br/>
-        <w:t>Ver diagrama visual en la plataforma SIG 360° → Módulo Bow-Tie → TP-BT-SST-001</w:t>
-      </w:r>
-    </w:p>
-    <w:p/>
-    <w:p>
-      <w:pPr>
+    <w:tbl>
+      <w:tblPr>
+        <w:tblStyle w:val="TableGrid"/>
+        <w:tblW w:type="auto" w:w="0"/>
         <w:jc w:val="center"/>
-      </w:pPr>
-      <w:r>
-        <w:rPr>
-          <w:i/>
-          <w:color w:val="94A3B8"/>
-          <w:sz w:val="16"/>
-        </w:rPr>
-        <w:t>Documento controlado — SIG 360° Tours Panasur E.I.R.L. | Proyecto CSF Hanaqpampa</w:t>
-      </w:r>
-    </w:p>
+        <w:tblLook w:firstColumn="1" w:firstRow="1" w:lastColumn="0" w:lastRow="0" w:noHBand="0" w:noVBand="1" w:val="04A0"/>
+      </w:tblPr>
+      <w:tblGrid>
+        <w:gridCol w:w="2493"/>
+        <w:gridCol w:w="2493"/>
+        <w:gridCol w:w="2493"/>
+        <w:gridCol w:w="2493"/>
+      </w:tblGrid>
+      <w:tr>
+        <w:tc>
+          <w:tcPr>
+            <w:tcW w:type="dxa" w:w="2493"/>
+            <w:shd w:fill="1A6B4E"/>
+          </w:tcPr>
+          <w:p>
+            <w:pPr>
+              <w:jc w:val="center"/>
+            </w:pPr>
+            <w:r/>
+            <w:r>
+              <w:rPr>
+                <w:rFonts w:ascii="Calibri" w:hAnsi="Calibri"/>
+                <w:b/>
+                <w:color w:val="FFFFFF"/>
+                <w:sz w:val="18"/>
+              </w:rPr>
+              <w:t>VERSIÓN</w:t>
+            </w:r>
+          </w:p>
+        </w:tc>
+        <w:tc>
+          <w:tcPr>
+            <w:tcW w:type="dxa" w:w="2493"/>
+            <w:shd w:fill="1A6B4E"/>
+          </w:tcPr>
+          <w:p>
+            <w:pPr>
+              <w:jc w:val="center"/>
+            </w:pPr>
+            <w:r/>
+            <w:r>
+              <w:rPr>
+                <w:rFonts w:ascii="Calibri" w:hAnsi="Calibri"/>
+                <w:b/>
+                <w:color w:val="FFFFFF"/>
+                <w:sz w:val="18"/>
+              </w:rPr>
+              <w:t>FECHA</w:t>
+            </w:r>
+          </w:p>
+        </w:tc>
+        <w:tc>
+          <w:tcPr>
+            <w:tcW w:type="dxa" w:w="2493"/>
+            <w:shd w:fill="1A6B4E"/>
+          </w:tcPr>
+          <w:p>
+            <w:pPr>
+              <w:jc w:val="center"/>
+            </w:pPr>
+            <w:r/>
+            <w:r>
+              <w:rPr>
+                <w:rFonts w:ascii="Calibri" w:hAnsi="Calibri"/>
+                <w:b/>
+                <w:color w:val="FFFFFF"/>
+                <w:sz w:val="18"/>
+              </w:rPr>
+              <w:t>DESCRIPCIÓN</w:t>
+            </w:r>
+          </w:p>
+        </w:tc>
+        <w:tc>
+          <w:tcPr>
+            <w:tcW w:type="dxa" w:w="2493"/>
+            <w:shd w:fill="1A6B4E"/>
+          </w:tcPr>
+          <w:p>
+            <w:pPr>
+              <w:jc w:val="center"/>
+            </w:pPr>
+            <w:r/>
+            <w:r>
+              <w:rPr>
+                <w:rFonts w:ascii="Calibri" w:hAnsi="Calibri"/>
+                <w:b/>
+                <w:color w:val="FFFFFF"/>
+                <w:sz w:val="18"/>
+              </w:rPr>
+              <w:t>RESPONSABLE</w:t>
+            </w:r>
+          </w:p>
+        </w:tc>
+      </w:tr>
+      <w:tr>
+        <w:tc>
+          <w:tcPr>
+            <w:tcW w:type="dxa" w:w="2493"/>
+          </w:tcPr>
+          <w:p>
+            <w:pPr>
+              <w:jc w:val="center"/>
+            </w:pPr>
+            <w:r/>
+            <w:r>
+              <w:rPr>
+                <w:rFonts w:ascii="Calibri" w:hAnsi="Calibri"/>
+                <w:sz w:val="18"/>
+              </w:rPr>
+              <w:t>1.0</w:t>
+            </w:r>
+          </w:p>
+        </w:tc>
+        <w:tc>
+          <w:tcPr>
+            <w:tcW w:type="dxa" w:w="2493"/>
+          </w:tcPr>
+          <w:p>
+            <w:pPr>
+              <w:jc w:val="center"/>
+            </w:pPr>
+            <w:r/>
+            <w:r>
+              <w:rPr>
+                <w:rFonts w:ascii="Calibri" w:hAnsi="Calibri"/>
+                <w:sz w:val="18"/>
+              </w:rPr>
+              <w:t>2026-04-03</w:t>
+            </w:r>
+          </w:p>
+        </w:tc>
+        <w:tc>
+          <w:tcPr>
+            <w:tcW w:type="dxa" w:w="2493"/>
+          </w:tcPr>
+          <w:p>
+            <w:pPr>
+              <w:jc w:val="center"/>
+            </w:pPr>
+            <w:r/>
+            <w:r>
+              <w:rPr>
+                <w:rFonts w:ascii="Calibri" w:hAnsi="Calibri"/>
+                <w:sz w:val="18"/>
+              </w:rPr>
+              <w:t>Emisión inicial</w:t>
+            </w:r>
+          </w:p>
+        </w:tc>
+        <w:tc>
+          <w:tcPr>
+            <w:tcW w:type="dxa" w:w="2493"/>
+          </w:tcPr>
+          <w:p>
+            <w:pPr>
+              <w:jc w:val="center"/>
+            </w:pPr>
+            <w:r/>
+            <w:r>
+              <w:rPr>
+                <w:rFonts w:ascii="Calibri" w:hAnsi="Calibri"/>
+                <w:sz w:val="18"/>
+              </w:rPr>
+              <w:t>INNOVAQ SOLUTIONS</w:t>
+            </w:r>
+          </w:p>
+        </w:tc>
+      </w:tr>
+    </w:tbl>
     <w:sectPr>
       <w:pgSz w:w="12240" w:h="15840"/>
-      <w:pgMar w:top="1440" w:right="1800" w:bottom="1440" w:left="1800" w:header="720" w:footer="720" w:gutter="0"/>
+      <w:pgMar w:top="1134" w:right="1134" w:bottom="1134" w:left="1134" w:header="720" w:footer="720" w:gutter="0"/>
       <w:cols w:space="720"/>
       <w:docGrid w:linePitch="360"/>
     </w:sectPr>

</xml_diff>